<commit_message>
Belge arşivi: kantin seti 2026.09.1 — resmî EK-1 formu bağı
okul-kantini-belgeleri 2026.09.1: aylık denetimde kullanılan resmî EK-1 Okul
Denetim Formunun (Doküman No 05.04.FR.91) merkezisgb.meb.gov.tr indirme adresi
OKUYUNUZ'a, FR-001 kalem 11'e ve FR-004 girişine yazıldı; formun gömülü satış
listesinin 2020 basımı olduğu ve 35. sorunun FR-006'daki güncel listeyle
değerlendirileceği notu eklendi (FR-006 girişinde de). FR-004 özet tablosunda
Süre sütunu genişletildi ("İvedilikle" bölünmesi giderildi). Bakanlık formu
pakete alınmadı, bağlantı verildi.

Co-Authored-By: Claude Fable 5.1 <noreply@anthropic.com>
</commit_message>
<xml_diff>
--- a/public/evrak/okul-kantini-belgeleri/GNL-KNT-FR-001_Kantin_Islem_Dosyasi_Kapak_ve_Kontrol_Listesi_v1.0.docx
+++ b/public/evrak/okul-kantini-belgeleri/GNL-KNT-FR-001_Kantin_Islem_Dosyasi_Kapak_ve_Kontrol_Listesi_v1.0.docx
@@ -1524,7 +1524,7 @@
                 <w:color w:val="4F4F4F"/>
                 <w:sz w:val="17"/>
               </w:rPr>
-              <w:t>Aylık denetim formları arşivi (resmî EK-1, 2 nüsha) + izleme çizelgesi (GNL-KNT-FR-004)</w:t>
+              <w:t>Aylık denetim formları arşivi (resmî EK-1 Okul Denetim Formu, 2 nüsha; boş form merkezisgb.meb.gov.tr Gıda İşletmeleri Denetimi sayfasından indirilir) + izleme çizelgesi (GNL-KNT-FR-004)</w:t>
             </w:r>
           </w:p>
         </w:tc>
@@ -2930,7 +2930,7 @@
           <w:color w:val="767676"/>
           <w:sz w:val="14"/>
         </w:rPr>
-        <w:t xml:space="preserve">Bu belge, okulapp.org üzerinde yayımlanan OKUL KANTİNİ GENEL BELGE SETİNİN parçasıdır (sürüm 2026.09 (14.09.2026)); resmî bir Bakanlık belgesi değildir. KIRMIZI köşeli parantezli alanlar ve üst bilgideki </w:t>
+        <w:t xml:space="preserve">Bu belge, okulapp.org üzerinde yayımlanan OKUL KANTİNİ GENEL BELGE SETİNİN parçasıdır (sürüm 2026.09.1 (14.09.2026)); resmî bir Bakanlık belgesi değildir. KIRMIZI köşeli parantezli alanlar ve üst bilgideki </w:t>
       </w:r>
       <w:r>
         <w:rPr>

</xml_diff>